<commit_message>
ces project code, README, and methodology review
</commit_message>
<xml_diff>
--- a/ces_elasticity/docs/methodology/CES_Project_Methodology.docx
+++ b/ces_elasticity/docs/methodology/CES_Project_Methodology.docx
@@ -456,7 +456,7 @@
         <w:rPr>
           <w:rFonts w:ascii="Calibri" w:hAnsi="Calibri" w:cs="Calibri"/>
         </w:rPr>
-        <w:t>A coefficient β1 above zero implies σ below infinity and determines whether capital intensity is associated with a higher or lower labour share. When σ &gt; 1, capital and labour are relatively substitutable. When σ = 1, the Cobb–Douglas benchmark applies. When σ &lt; 1, the two inputs are more complementary.</w:t>
+        <w:t>A positive β1 implies σ &lt; 1 (complementarity), while a negative β1 implies σ &gt; 1 (substitutability). When β1 = 0, the Cobb–Douglas benchmark (σ = 1) applies.</w:t>
       </w:r>
     </w:p>
     <w:p>
@@ -911,6 +911,14 @@
     </w:p>
     <w:p>
       <w:pPr>
+        <w:spacing w:after="0" w:line="240" w:lineRule="auto"/>
+        <w:rPr>
+          <w:rFonts w:ascii="Calibri" w:hAnsi="Calibri" w:cs="Calibri"/>
+        </w:rPr>
+      </w:pPr>
+    </w:p>
+    <w:p>
+      <w:pPr>
         <w:pStyle w:val="Heading2"/>
         <w:spacing w:before="0" w:line="240" w:lineRule="auto"/>
         <w:rPr>
@@ -956,6 +964,7 @@
         <w:rPr>
           <w:rFonts w:ascii="Calibri" w:hAnsi="Calibri" w:cs="Calibri"/>
         </w:rPr>
+        <w:lastRenderedPageBreak/>
         <w:t>AMECO: NLHT = total hours worked</w:t>
       </w:r>
     </w:p>
@@ -970,7 +979,6 @@
         <w:rPr>
           <w:rFonts w:ascii="Calibri" w:hAnsi="Calibri" w:cs="Calibri"/>
         </w:rPr>
-        <w:lastRenderedPageBreak/>
         <w:t>OECD: HRSTO = hours worked for total employment</w:t>
       </w:r>
     </w:p>
@@ -2108,6 +2116,7 @@
         <w:rPr>
           <w:rFonts w:ascii="Calibri" w:hAnsi="Calibri" w:cs="Calibri"/>
         </w:rPr>
+        <w:lastRenderedPageBreak/>
         <w:t>y_c = β0 + β1 x_c + ε_c</w:t>
       </w:r>
     </w:p>
@@ -2123,7 +2132,6 @@
           <w:rFonts w:ascii="Calibri" w:hAnsi="Calibri" w:cs="Calibri"/>
           <w:b/>
         </w:rPr>
-        <w:lastRenderedPageBreak/>
         <w:t xml:space="preserve">Visual diagnostics. </w:t>
       </w:r>
       <w:r>
@@ -2310,6 +2318,24 @@
         </w:rPr>
         <w:t>gK ≈ capital services growth</w:t>
       </w:r>
+      <w:r>
+        <w:rPr>
+          <w:rFonts w:ascii="Calibri" w:hAnsi="Calibri" w:cs="Calibri"/>
+        </w:rPr>
+        <w:t xml:space="preserve"> (</w:t>
+      </w:r>
+      <w:r>
+        <w:rPr>
+          <w:rFonts w:ascii="Calibri" w:hAnsi="Calibri" w:cs="Calibri"/>
+        </w:rPr>
+        <w:t>Capital services growth is provided in percentage terms and is treated as an approximation of Δln(K), which is standard in growth accounting when changes are small</w:t>
+      </w:r>
+      <w:r>
+        <w:rPr>
+          <w:rFonts w:ascii="Calibri" w:hAnsi="Calibri" w:cs="Calibri"/>
+        </w:rPr>
+        <w:t>).</w:t>
+      </w:r>
     </w:p>
     <w:p>
       <w:pPr>
@@ -2384,15 +2410,8 @@
       <w:r>
         <w:rPr>
           <w:rFonts w:ascii="Calibri" w:hAnsi="Calibri" w:cs="Calibri"/>
-          <w:b/>
-        </w:rPr>
-        <w:t xml:space="preserve">Fixed effects. </w:t>
-      </w:r>
-      <w:r>
-        <w:rPr>
-          <w:rFonts w:ascii="Calibri" w:hAnsi="Calibri" w:cs="Calibri"/>
-        </w:rPr>
-        <w:t>Country fixed effects absorb persistent structural differences across G7 economies. Time fixed effects absorb common global shocks, such as crises or commodity-price movements.</w:t>
+        </w:rPr>
+        <w:t>In the growth specification, β1 captures how changes in capital intensity (in terms of capital services per hour) are associated with changes in the functional distribution of income over time within countries.</w:t>
       </w:r>
     </w:p>
     <w:p>
@@ -2407,17 +2426,38 @@
           <w:rFonts w:ascii="Calibri" w:hAnsi="Calibri" w:cs="Calibri"/>
           <w:b/>
         </w:rPr>
-        <w:t xml:space="preserve">Charts. </w:t>
-      </w:r>
-      <w:r>
-        <w:rPr>
-          <w:rFonts w:ascii="Calibri" w:hAnsi="Calibri" w:cs="Calibri"/>
-        </w:rPr>
-        <w:t>A useful descriptive chart is a time-series scatter for one country at a time, or for at most a few benchmark countries, with X = Δx and Y = Δy. This is not a substitute for panel regression, but it is useful for visual intuition.</w:t>
+        <w:t xml:space="preserve">Fixed effects. </w:t>
+      </w:r>
+      <w:r>
+        <w:rPr>
+          <w:rFonts w:ascii="Calibri" w:hAnsi="Calibri" w:cs="Calibri"/>
+        </w:rPr>
+        <w:t>Country fixed effects absorb persistent structural differences across G7 economies. Time fixed effects absorb common global shocks, such as crises or commodity-price movements.</w:t>
       </w:r>
     </w:p>
     <w:p>
       <w:pPr>
+        <w:spacing w:after="0" w:line="240" w:lineRule="auto"/>
+        <w:rPr>
+          <w:rFonts w:ascii="Calibri" w:hAnsi="Calibri" w:cs="Calibri"/>
+        </w:rPr>
+      </w:pPr>
+      <w:r>
+        <w:rPr>
+          <w:rFonts w:ascii="Calibri" w:hAnsi="Calibri" w:cs="Calibri"/>
+          <w:b/>
+        </w:rPr>
+        <w:t xml:space="preserve">Charts. </w:t>
+      </w:r>
+      <w:r>
+        <w:rPr>
+          <w:rFonts w:ascii="Calibri" w:hAnsi="Calibri" w:cs="Calibri"/>
+        </w:rPr>
+        <w:t>A useful descriptive chart is a time-series scatter for one country at a time, or for at most a few benchmark countries, with X = Δx and Y = Δy. This is not a substitute for panel regression, but it is useful for visual intuition.</w:t>
+      </w:r>
+    </w:p>
+    <w:p>
+      <w:pPr>
         <w:pStyle w:val="Heading2"/>
         <w:spacing w:before="0" w:line="240" w:lineRule="auto"/>
         <w:rPr>
@@ -2597,15 +2637,8 @@
       <w:r>
         <w:rPr>
           <w:rFonts w:ascii="Calibri" w:hAnsi="Calibri" w:cs="Calibri"/>
-          <w:b/>
-        </w:rPr>
-        <w:t xml:space="preserve">Why the full panel is preferred. </w:t>
-      </w:r>
-      <w:r>
-        <w:rPr>
-          <w:rFonts w:ascii="Calibri" w:hAnsi="Calibri" w:cs="Calibri"/>
-        </w:rPr>
-        <w:t>Estimating country by country would severely reduce variation and statistical power. The full panel keeps the time dimension, the country dimension, and the industry dimension simultaneously.</w:t>
+        </w:rPr>
+        <w:t>In the sectoral specification, β1 captures how sector-specific capital deepening dynamics relate to changes in labour share within country-industry units.</w:t>
       </w:r>
     </w:p>
     <w:p>
@@ -2620,13 +2653,13 @@
           <w:rFonts w:ascii="Calibri" w:hAnsi="Calibri" w:cs="Calibri"/>
           <w:b/>
         </w:rPr>
-        <w:t xml:space="preserve">Sector choice. </w:t>
-      </w:r>
-      <w:r>
-        <w:rPr>
-          <w:rFonts w:ascii="Calibri" w:hAnsi="Calibri" w:cs="Calibri"/>
-        </w:rPr>
-        <w:t>The discussion established that the service aggregate is too broad to be fully informative, but arbitrary cherry-picking of a few service subsectors is undesirable. The preferred solution is therefore to include all available market-relevant service activities that are consistently measured in the OECD database, and to treat the sectoral model as an extension rather than as the only model.</w:t>
+        <w:t xml:space="preserve">Why the full panel is preferred. </w:t>
+      </w:r>
+      <w:r>
+        <w:rPr>
+          <w:rFonts w:ascii="Calibri" w:hAnsi="Calibri" w:cs="Calibri"/>
+        </w:rPr>
+        <w:t>Estimating country by country would severely reduce variation and statistical power. The full panel keeps the time dimension, the country dimension, and the industry dimension simultaneously.</w:t>
       </w:r>
     </w:p>
     <w:p>
@@ -2636,9 +2669,37 @@
           <w:rFonts w:ascii="Calibri" w:hAnsi="Calibri" w:cs="Calibri"/>
         </w:rPr>
       </w:pPr>
+      <w:r>
+        <w:rPr>
+          <w:rFonts w:ascii="Calibri" w:hAnsi="Calibri" w:cs="Calibri"/>
+          <w:b/>
+        </w:rPr>
+        <w:t xml:space="preserve">Sector choice. </w:t>
+      </w:r>
+      <w:r>
+        <w:rPr>
+          <w:rFonts w:ascii="Calibri" w:hAnsi="Calibri" w:cs="Calibri"/>
+        </w:rPr>
+        <w:t xml:space="preserve">The discussion established that the service aggregate is too broad to be fully informative, but arbitrary cherry-picking of a few service subsectors is undesirable. The preferred solution is therefore to include all available </w:t>
+      </w:r>
+      <w:r>
+        <w:rPr>
+          <w:rFonts w:ascii="Calibri" w:hAnsi="Calibri" w:cs="Calibri"/>
+        </w:rPr>
+        <w:lastRenderedPageBreak/>
+        <w:t>market-relevant service activities that are consistently measured in the OECD database, and to treat the sectoral model as an extension rather than as the only model.</w:t>
+      </w:r>
     </w:p>
     <w:p>
       <w:pPr>
+        <w:spacing w:after="0" w:line="240" w:lineRule="auto"/>
+        <w:rPr>
+          <w:rFonts w:ascii="Calibri" w:hAnsi="Calibri" w:cs="Calibri"/>
+        </w:rPr>
+      </w:pPr>
+    </w:p>
+    <w:p>
+      <w:pPr>
         <w:pStyle w:val="Heading1"/>
         <w:spacing w:before="0" w:line="240" w:lineRule="auto"/>
         <w:rPr>
@@ -2670,14 +2731,7 @@
         <w:rPr>
           <w:rFonts w:ascii="Calibri" w:hAnsi="Calibri" w:cs="Calibri"/>
         </w:rPr>
-        <w:t xml:space="preserve">The project relies on three distinct sources of variation. The level model uses cross-country differences in capital intensity across advanced economies. The non-sectoral growth model uses within-country time variation </w:t>
-      </w:r>
-      <w:r>
-        <w:rPr>
-          <w:rFonts w:ascii="Calibri" w:hAnsi="Calibri" w:cs="Calibri"/>
-        </w:rPr>
-        <w:lastRenderedPageBreak/>
-        <w:t>across G7 economies. The sectoral model adds within-country, between-industry variation. The purpose of the three-model structure is precisely to avoid over-reliance on any one source of identification.</w:t>
+        <w:t>The project relies on three distinct sources of variation. The level model uses cross-country differences in capital intensity across advanced economies. The non-sectoral growth model uses within-country time variation across G7 economies. The sectoral model adds within-country, between-industry variation. The purpose of the three-model structure is precisely to avoid over-reliance on any one source of identification.</w:t>
       </w:r>
     </w:p>
     <w:p>
@@ -2768,6 +2822,21 @@
           <w:rFonts w:ascii="Calibri" w:hAnsi="Calibri" w:cs="Calibri"/>
         </w:rPr>
         <w:t>Currency comparability. OECD growth models avoid the problem because growth rates are effectively unit-free. This is the main reason the OECD models are formulated in dynamic rather than level form.</w:t>
+      </w:r>
+    </w:p>
+    <w:p>
+      <w:pPr>
+        <w:pStyle w:val="ListBullet"/>
+        <w:spacing w:after="0" w:line="240" w:lineRule="auto"/>
+        <w:rPr>
+          <w:rFonts w:ascii="Calibri" w:hAnsi="Calibri" w:cs="Calibri"/>
+        </w:rPr>
+      </w:pPr>
+      <w:r>
+        <w:rPr>
+          <w:rFonts w:ascii="Calibri" w:hAnsi="Calibri" w:cs="Calibri"/>
+        </w:rPr>
+        <w:t>Functional form. The CES specification imposes a specific parametric structure on the relationship between factor shares and capital intensity. If the true production technology deviates from CES, the estimated elasticity may reflect approximation error rather than a structural parameter.</w:t>
       </w:r>
     </w:p>
     <w:p>
@@ -2860,6 +2929,132 @@
           <w:rFonts w:ascii="Calibri" w:hAnsi="Calibri" w:cs="Calibri"/>
         </w:rPr>
         <w:t>Recommended columns: country, country_code, year, labour_compensation_lc, gva, capital_services_growth_kser, hours_hrsto. For the sectoral version add economic_activity and economic_activity_code.</w:t>
+      </w:r>
+    </w:p>
+    <w:p>
+      <w:pPr>
+        <w:spacing w:after="0" w:line="240" w:lineRule="auto"/>
+        <w:rPr>
+          <w:rFonts w:ascii="Calibri" w:hAnsi="Calibri" w:cs="Calibri"/>
+        </w:rPr>
+      </w:pPr>
+      <w:r>
+        <w:rPr>
+          <w:rFonts w:ascii="Calibri" w:hAnsi="Calibri" w:cs="Calibri"/>
+          <w:b/>
+        </w:rPr>
+        <w:t xml:space="preserve">Empirical outputs. </w:t>
+      </w:r>
+      <w:r>
+        <w:rPr>
+          <w:rFonts w:ascii="Calibri" w:hAnsi="Calibri" w:cs="Calibri"/>
+          <w:bCs/>
+        </w:rPr>
+        <w:t xml:space="preserve">In </w:t>
+      </w:r>
+      <w:r>
+        <w:rPr>
+          <w:rFonts w:ascii="Calibri" w:hAnsi="Calibri" w:cs="Calibri"/>
+        </w:rPr>
+        <w:t>addition to the text-based summary, the project exports structured CSV files including:</w:t>
+      </w:r>
+    </w:p>
+    <w:p>
+      <w:pPr>
+        <w:pStyle w:val="ListParagraph"/>
+        <w:numPr>
+          <w:ilvl w:val="0"/>
+          <w:numId w:val="10"/>
+        </w:numPr>
+        <w:spacing w:after="0" w:line="240" w:lineRule="auto"/>
+        <w:rPr>
+          <w:rFonts w:ascii="Calibri" w:hAnsi="Calibri" w:cs="Calibri"/>
+        </w:rPr>
+      </w:pPr>
+      <w:r>
+        <w:rPr>
+          <w:rFonts w:ascii="Calibri" w:hAnsi="Calibri" w:cs="Calibri"/>
+        </w:rPr>
+        <w:t>cleaned datasets,</w:t>
+      </w:r>
+    </w:p>
+    <w:p>
+      <w:pPr>
+        <w:pStyle w:val="ListParagraph"/>
+        <w:numPr>
+          <w:ilvl w:val="0"/>
+          <w:numId w:val="10"/>
+        </w:numPr>
+        <w:spacing w:after="0" w:line="240" w:lineRule="auto"/>
+        <w:rPr>
+          <w:rFonts w:ascii="Calibri" w:hAnsi="Calibri" w:cs="Calibri"/>
+        </w:rPr>
+      </w:pPr>
+      <w:r>
+        <w:rPr>
+          <w:rFonts w:ascii="Calibri" w:hAnsi="Calibri" w:cs="Calibri"/>
+        </w:rPr>
+        <w:t>regression samples,</w:t>
+      </w:r>
+    </w:p>
+    <w:p>
+      <w:pPr>
+        <w:pStyle w:val="ListParagraph"/>
+        <w:numPr>
+          <w:ilvl w:val="0"/>
+          <w:numId w:val="10"/>
+        </w:numPr>
+        <w:spacing w:after="0" w:line="240" w:lineRule="auto"/>
+        <w:rPr>
+          <w:rFonts w:ascii="Calibri" w:hAnsi="Calibri" w:cs="Calibri"/>
+        </w:rPr>
+      </w:pPr>
+      <w:r>
+        <w:rPr>
+          <w:rFonts w:ascii="Calibri" w:hAnsi="Calibri" w:cs="Calibri"/>
+        </w:rPr>
+        <w:t>full regression tables,</w:t>
+      </w:r>
+    </w:p>
+    <w:p>
+      <w:pPr>
+        <w:pStyle w:val="ListParagraph"/>
+        <w:numPr>
+          <w:ilvl w:val="0"/>
+          <w:numId w:val="10"/>
+        </w:numPr>
+        <w:spacing w:after="0" w:line="240" w:lineRule="auto"/>
+        <w:rPr>
+          <w:rFonts w:ascii="Calibri" w:hAnsi="Calibri" w:cs="Calibri"/>
+        </w:rPr>
+      </w:pPr>
+      <w:r>
+        <w:rPr>
+          <w:rFonts w:ascii="Calibri" w:hAnsi="Calibri" w:cs="Calibri"/>
+        </w:rPr>
+        <w:t>compact model summaries.</w:t>
+      </w:r>
+    </w:p>
+    <w:p>
+      <w:pPr>
+        <w:spacing w:after="0" w:line="240" w:lineRule="auto"/>
+        <w:rPr>
+          <w:rFonts w:ascii="Calibri" w:hAnsi="Calibri" w:cs="Calibri"/>
+        </w:rPr>
+      </w:pPr>
+    </w:p>
+    <w:p>
+      <w:pPr>
+        <w:spacing w:after="0" w:line="240" w:lineRule="auto"/>
+        <w:rPr>
+          <w:rFonts w:ascii="Calibri" w:hAnsi="Calibri" w:cs="Calibri"/>
+        </w:rPr>
+      </w:pPr>
+      <w:r>
+        <w:rPr>
+          <w:rFonts w:ascii="Calibri" w:hAnsi="Calibri" w:cs="Calibri"/>
+        </w:rPr>
+        <w:t>This allows replication and further analysis in external tools such as Excel, R, or Stata.</w:t>
       </w:r>
     </w:p>
     <w:sectPr>
@@ -3043,6 +3238,208 @@
       <w:rPr>
         <w:rFonts w:ascii="Symbol" w:hAnsi="Symbol" w:hint="default"/>
       </w:rPr>
+    </w:lvl>
+  </w:abstractNum>
+  <w:abstractNum w:abstractNumId="9" w15:restartNumberingAfterBreak="0">
+    <w:nsid w:val="0F8751FD"/>
+    <w:multiLevelType w:val="hybridMultilevel"/>
+    <w:tmpl w:val="55564E5C"/>
+    <w:lvl w:ilvl="0" w:tplc="04090001">
+      <w:start w:val="1"/>
+      <w:numFmt w:val="bullet"/>
+      <w:lvlText w:val=""/>
+      <w:lvlJc w:val="left"/>
+      <w:pPr>
+        <w:ind w:left="360" w:hanging="360"/>
+      </w:pPr>
+      <w:rPr>
+        <w:rFonts w:ascii="Symbol" w:hAnsi="Symbol" w:hint="default"/>
+      </w:rPr>
+    </w:lvl>
+    <w:lvl w:ilvl="1" w:tplc="04090003" w:tentative="1">
+      <w:start w:val="1"/>
+      <w:numFmt w:val="bullet"/>
+      <w:lvlText w:val="o"/>
+      <w:lvlJc w:val="left"/>
+      <w:pPr>
+        <w:ind w:left="1080" w:hanging="360"/>
+      </w:pPr>
+      <w:rPr>
+        <w:rFonts w:ascii="Courier New" w:hAnsi="Courier New" w:cs="Courier New" w:hint="default"/>
+      </w:rPr>
+    </w:lvl>
+    <w:lvl w:ilvl="2" w:tplc="04090005" w:tentative="1">
+      <w:start w:val="1"/>
+      <w:numFmt w:val="bullet"/>
+      <w:lvlText w:val=""/>
+      <w:lvlJc w:val="left"/>
+      <w:pPr>
+        <w:ind w:left="1800" w:hanging="360"/>
+      </w:pPr>
+      <w:rPr>
+        <w:rFonts w:ascii="Wingdings" w:hAnsi="Wingdings" w:hint="default"/>
+      </w:rPr>
+    </w:lvl>
+    <w:lvl w:ilvl="3" w:tplc="04090001" w:tentative="1">
+      <w:start w:val="1"/>
+      <w:numFmt w:val="bullet"/>
+      <w:lvlText w:val=""/>
+      <w:lvlJc w:val="left"/>
+      <w:pPr>
+        <w:ind w:left="2520" w:hanging="360"/>
+      </w:pPr>
+      <w:rPr>
+        <w:rFonts w:ascii="Symbol" w:hAnsi="Symbol" w:hint="default"/>
+      </w:rPr>
+    </w:lvl>
+    <w:lvl w:ilvl="4" w:tplc="04090003" w:tentative="1">
+      <w:start w:val="1"/>
+      <w:numFmt w:val="bullet"/>
+      <w:lvlText w:val="o"/>
+      <w:lvlJc w:val="left"/>
+      <w:pPr>
+        <w:ind w:left="3240" w:hanging="360"/>
+      </w:pPr>
+      <w:rPr>
+        <w:rFonts w:ascii="Courier New" w:hAnsi="Courier New" w:cs="Courier New" w:hint="default"/>
+      </w:rPr>
+    </w:lvl>
+    <w:lvl w:ilvl="5" w:tplc="04090005" w:tentative="1">
+      <w:start w:val="1"/>
+      <w:numFmt w:val="bullet"/>
+      <w:lvlText w:val=""/>
+      <w:lvlJc w:val="left"/>
+      <w:pPr>
+        <w:ind w:left="3960" w:hanging="360"/>
+      </w:pPr>
+      <w:rPr>
+        <w:rFonts w:ascii="Wingdings" w:hAnsi="Wingdings" w:hint="default"/>
+      </w:rPr>
+    </w:lvl>
+    <w:lvl w:ilvl="6" w:tplc="04090001" w:tentative="1">
+      <w:start w:val="1"/>
+      <w:numFmt w:val="bullet"/>
+      <w:lvlText w:val=""/>
+      <w:lvlJc w:val="left"/>
+      <w:pPr>
+        <w:ind w:left="4680" w:hanging="360"/>
+      </w:pPr>
+      <w:rPr>
+        <w:rFonts w:ascii="Symbol" w:hAnsi="Symbol" w:hint="default"/>
+      </w:rPr>
+    </w:lvl>
+    <w:lvl w:ilvl="7" w:tplc="04090003" w:tentative="1">
+      <w:start w:val="1"/>
+      <w:numFmt w:val="bullet"/>
+      <w:lvlText w:val="o"/>
+      <w:lvlJc w:val="left"/>
+      <w:pPr>
+        <w:ind w:left="5400" w:hanging="360"/>
+      </w:pPr>
+      <w:rPr>
+        <w:rFonts w:ascii="Courier New" w:hAnsi="Courier New" w:cs="Courier New" w:hint="default"/>
+      </w:rPr>
+    </w:lvl>
+    <w:lvl w:ilvl="8" w:tplc="04090005" w:tentative="1">
+      <w:start w:val="1"/>
+      <w:numFmt w:val="bullet"/>
+      <w:lvlText w:val=""/>
+      <w:lvlJc w:val="left"/>
+      <w:pPr>
+        <w:ind w:left="6120" w:hanging="360"/>
+      </w:pPr>
+      <w:rPr>
+        <w:rFonts w:ascii="Wingdings" w:hAnsi="Wingdings" w:hint="default"/>
+      </w:rPr>
+    </w:lvl>
+  </w:abstractNum>
+  <w:abstractNum w:abstractNumId="10" w15:restartNumberingAfterBreak="0">
+    <w:nsid w:val="1D0D3C23"/>
+    <w:multiLevelType w:val="hybridMultilevel"/>
+    <w:tmpl w:val="7944871A"/>
+    <w:lvl w:ilvl="0" w:tplc="64B603FE">
+      <w:start w:val="1"/>
+      <w:numFmt w:val="lowerRoman"/>
+      <w:lvlText w:val="(%1)"/>
+      <w:lvlJc w:val="left"/>
+      <w:pPr>
+        <w:ind w:left="1080" w:hanging="720"/>
+      </w:pPr>
+      <w:rPr>
+        <w:rFonts w:hint="default"/>
+      </w:rPr>
+    </w:lvl>
+    <w:lvl w:ilvl="1" w:tplc="04090019" w:tentative="1">
+      <w:start w:val="1"/>
+      <w:numFmt w:val="lowerLetter"/>
+      <w:lvlText w:val="%2."/>
+      <w:lvlJc w:val="left"/>
+      <w:pPr>
+        <w:ind w:left="1440" w:hanging="360"/>
+      </w:pPr>
+    </w:lvl>
+    <w:lvl w:ilvl="2" w:tplc="0409001B" w:tentative="1">
+      <w:start w:val="1"/>
+      <w:numFmt w:val="lowerRoman"/>
+      <w:lvlText w:val="%3."/>
+      <w:lvlJc w:val="right"/>
+      <w:pPr>
+        <w:ind w:left="2160" w:hanging="180"/>
+      </w:pPr>
+    </w:lvl>
+    <w:lvl w:ilvl="3" w:tplc="0409000F" w:tentative="1">
+      <w:start w:val="1"/>
+      <w:numFmt w:val="decimal"/>
+      <w:lvlText w:val="%4."/>
+      <w:lvlJc w:val="left"/>
+      <w:pPr>
+        <w:ind w:left="2880" w:hanging="360"/>
+      </w:pPr>
+    </w:lvl>
+    <w:lvl w:ilvl="4" w:tplc="04090019" w:tentative="1">
+      <w:start w:val="1"/>
+      <w:numFmt w:val="lowerLetter"/>
+      <w:lvlText w:val="%5."/>
+      <w:lvlJc w:val="left"/>
+      <w:pPr>
+        <w:ind w:left="3600" w:hanging="360"/>
+      </w:pPr>
+    </w:lvl>
+    <w:lvl w:ilvl="5" w:tplc="0409001B" w:tentative="1">
+      <w:start w:val="1"/>
+      <w:numFmt w:val="lowerRoman"/>
+      <w:lvlText w:val="%6."/>
+      <w:lvlJc w:val="right"/>
+      <w:pPr>
+        <w:ind w:left="4320" w:hanging="180"/>
+      </w:pPr>
+    </w:lvl>
+    <w:lvl w:ilvl="6" w:tplc="0409000F" w:tentative="1">
+      <w:start w:val="1"/>
+      <w:numFmt w:val="decimal"/>
+      <w:lvlText w:val="%7."/>
+      <w:lvlJc w:val="left"/>
+      <w:pPr>
+        <w:ind w:left="5040" w:hanging="360"/>
+      </w:pPr>
+    </w:lvl>
+    <w:lvl w:ilvl="7" w:tplc="04090019" w:tentative="1">
+      <w:start w:val="1"/>
+      <w:numFmt w:val="lowerLetter"/>
+      <w:lvlText w:val="%8."/>
+      <w:lvlJc w:val="left"/>
+      <w:pPr>
+        <w:ind w:left="5760" w:hanging="360"/>
+      </w:pPr>
+    </w:lvl>
+    <w:lvl w:ilvl="8" w:tplc="0409001B" w:tentative="1">
+      <w:start w:val="1"/>
+      <w:numFmt w:val="lowerRoman"/>
+      <w:lvlText w:val="%9."/>
+      <w:lvlJc w:val="right"/>
+      <w:pPr>
+        <w:ind w:left="6480" w:hanging="180"/>
+      </w:pPr>
     </w:lvl>
   </w:abstractNum>
   <w:num w:numId="1" w16cid:durableId="1501503886">
@@ -3071,6 +3468,12 @@
   </w:num>
   <w:num w:numId="9" w16cid:durableId="1674070097">
     <w:abstractNumId w:val="0"/>
+  </w:num>
+  <w:num w:numId="10" w16cid:durableId="1417819546">
+    <w:abstractNumId w:val="9"/>
+  </w:num>
+  <w:num w:numId="11" w16cid:durableId="841435735">
+    <w:abstractNumId w:val="10"/>
   </w:num>
 </w:numbering>
 </file>

</xml_diff>

<commit_message>
Development Economics Analysis- full empirical pipeline
</commit_message>
<xml_diff>
--- a/ces_elasticity/docs/methodology/CES_Project_Methodology.docx
+++ b/ces_elasticity/docs/methodology/CES_Project_Methodology.docx
@@ -2138,7 +2138,19 @@
         <w:rPr>
           <w:rFonts w:ascii="Calibri" w:hAnsi="Calibri" w:cs="Calibri"/>
         </w:rPr>
-        <w:t>A cross-country scatter plot should be produced with the share ratio on one axis and capital intensity on the other. The theoretically preferred chart is log-log, i.e. X = ln(K/H) and Y = ln(sL/sK). A level-level scatter may still be shown as a descriptive complement.</w:t>
+        <w:t xml:space="preserve">A cross-country scatter plot </w:t>
+      </w:r>
+      <w:r>
+        <w:rPr>
+          <w:rFonts w:ascii="Calibri" w:hAnsi="Calibri" w:cs="Calibri"/>
+        </w:rPr>
+        <w:t xml:space="preserve">is </w:t>
+      </w:r>
+      <w:r>
+        <w:rPr>
+          <w:rFonts w:ascii="Calibri" w:hAnsi="Calibri" w:cs="Calibri"/>
+        </w:rPr>
+        <w:t>produced with the share ratio on one axis and capital intensity on the other. The theoretically preferred chart is log-log, i.e. X = ln(K/H) and Y = ln(sL/sK). A level-level scatter may still be shown as a descriptive complement.</w:t>
       </w:r>
     </w:p>
     <w:p>
@@ -2610,7 +2622,19 @@
         <w:rPr>
           <w:rFonts w:ascii="Calibri" w:hAnsi="Calibri" w:cs="Calibri"/>
         </w:rPr>
-        <w:t>The sectoral specification should not be estimated country by country unless the sample is tiny and used only for descriptive robustness. The correct main design is a full country-sector-time panel:</w:t>
+        <w:t xml:space="preserve">The sectoral specification </w:t>
+      </w:r>
+      <w:r>
+        <w:rPr>
+          <w:rFonts w:ascii="Calibri" w:hAnsi="Calibri" w:cs="Calibri"/>
+        </w:rPr>
+        <w:t>is</w:t>
+      </w:r>
+      <w:r>
+        <w:rPr>
+          <w:rFonts w:ascii="Calibri" w:hAnsi="Calibri" w:cs="Calibri"/>
+        </w:rPr>
+        <w:t xml:space="preserve"> estimated country by country unless the sample is tiny and used only for descriptive robustness. The correct main design is a full country-sector-time panel:</w:t>
       </w:r>
     </w:p>
     <w:p>
@@ -2886,7 +2910,31 @@
         <w:rPr>
           <w:rFonts w:ascii="Calibri" w:hAnsi="Calibri" w:cs="Calibri"/>
         </w:rPr>
-        <w:t>Both the level and growth datasets should be stored in long format. Each row should represent one observation, i.e. one country-year pair in the aggregate models and one country-sector-year triple in the sectoral model. This is the correct format for Python-based cleaning, graphing, and panel estimation.</w:t>
+        <w:t xml:space="preserve">Both the level and growth datasets </w:t>
+      </w:r>
+      <w:r>
+        <w:rPr>
+          <w:rFonts w:ascii="Calibri" w:hAnsi="Calibri" w:cs="Calibri"/>
+        </w:rPr>
+        <w:t>is</w:t>
+      </w:r>
+      <w:r>
+        <w:rPr>
+          <w:rFonts w:ascii="Calibri" w:hAnsi="Calibri" w:cs="Calibri"/>
+        </w:rPr>
+        <w:t xml:space="preserve"> stored in long format. Each row represent</w:t>
+      </w:r>
+      <w:r>
+        <w:rPr>
+          <w:rFonts w:ascii="Calibri" w:hAnsi="Calibri" w:cs="Calibri"/>
+        </w:rPr>
+        <w:t>s</w:t>
+      </w:r>
+      <w:r>
+        <w:rPr>
+          <w:rFonts w:ascii="Calibri" w:hAnsi="Calibri" w:cs="Calibri"/>
+        </w:rPr>
+        <w:t xml:space="preserve"> one observation, i.e. one country-year pair in the aggregate models and one country-sector-year triple in the sectoral model. This is the correct format for Python-based cleaning, graphing, and panel estimation.</w:t>
       </w:r>
     </w:p>
     <w:p>

</xml_diff>